<commit_message>
Variant 2 frame: try swirligig art, add border catalogue, guide for Word 2010 (RU UI)
- 'quadrants' renders as squares in Word, switch to 'swirligig'
- Ramky_vybir.docx: one page per candidate art border, labelled, to pick the right one
- Guide rewritten with the exact Word 2010 Russian-UI button names

Co-Authored-By: Claude Opus 5.5 <noreply@anthropic.com>
Claude-Session: https://claude.ai/code/session_01NMobVqPmAxNmUbsnyQwyS9
</commit_message>
<xml_diff>
--- a/informatyka/Variant_2.docx
+++ b/informatyka/Variant_2.docx
@@ -1055,10 +1055,10 @@
       <w:pgSz w:w="11906" w:h="16838"/>
       <w:pgMar w:top="850" w:right="1134" w:bottom="850" w:left="1418" w:header="567" w:footer="397" w:gutter="0"/>
       <w:pgBorders w:offsetFrom="page">
-        <w:top w:val="quadrants" w:sz="16" w:space="20" w:color="C00000"/>
-        <w:left w:val="quadrants" w:sz="16" w:space="20" w:color="C00000"/>
-        <w:bottom w:val="quadrants" w:sz="16" w:space="20" w:color="C00000"/>
-        <w:right w:val="quadrants" w:sz="16" w:space="20" w:color="C00000"/>
+        <w:top w:val="swirligig" w:sz="16" w:space="20" w:color="C00000"/>
+        <w:left w:val="swirligig" w:sz="16" w:space="20" w:color="C00000"/>
+        <w:bottom w:val="swirligig" w:sz="16" w:space="20" w:color="C00000"/>
+        <w:right w:val="swirligig" w:sz="16" w:space="20" w:color="C00000"/>
       </w:pgBorders>
       <w:cols w:space="708"/>
     </w:sectPr>

</xml_diff>